<commit_message>
Updated BFLA Folder - BFLA Report, Scr, and ReadMe file
</commit_message>
<xml_diff>
--- a/BFLA/report/CRAPI BROKEN FUNCTION LEVEL AUTHORISATION.docx
+++ b/BFLA/report/CRAPI BROKEN FUNCTION LEVEL AUTHORISATION.docx
@@ -224,7 +224,6 @@
           </mc:Fallback>
         </mc:AlternateContent>
       </w:r>
-      <w:bookmarkStart w:id="0" w:name="_GoBack"/>
       <w:r>
         <w:drawing>
           <wp:anchor distT="0" distB="0" distL="114300" distR="114300" simplePos="0" relativeHeight="251660288" behindDoc="1" locked="0" layoutInCell="1" allowOverlap="1">
@@ -272,7 +271,6 @@
           </wp:anchor>
         </w:drawing>
       </w:r>
-      <w:bookmarkEnd w:id="0"/>
     </w:p>
     <w:p>
       <w:pPr>
@@ -321,16 +319,8 @@
           <w:rFonts w:hint="default"/>
           <w:lang w:val="en-US"/>
         </w:rPr>
-        <w:t xml:space="preserve">According to OWASP, Broken Object Level Authoristation (BOLA) is a security flaw that occurs when an API (Application Programming Interface) does not properly enforce authorisation checks for each object accessed by a client. Attackers can manipulate Resource ID, tokens, etc to access resources that they’re not authorised for example PII (Personally Identifiable Information). </w:t>
-      </w:r>
-    </w:p>
-    <w:p>
-      <w:pPr>
-        <w:rPr>
-          <w:rFonts w:hint="default"/>
-          <w:lang w:val="en-US"/>
-        </w:rPr>
-      </w:pPr>
+        <w:t xml:space="preserve">Broken Function Level Authorisation is an access control vulnerability whereby a user can perform unauthorised administrative actions. </w:t>
+      </w:r>
     </w:p>
     <w:p>
       <w:pPr>
@@ -353,33 +343,16 @@
       <w:pPr>
         <w:rPr>
           <w:rFonts w:hint="default"/>
-          <w:highlight w:val="yellow"/>
-          <w:lang w:val="en-US"/>
-        </w:rPr>
-      </w:pPr>
-      <w:r>
-        <w:rPr>
-          <w:rFonts w:hint="default"/>
-          <w:lang w:val="en-US"/>
-        </w:rPr>
-        <w:t>The objective of this assessment was to determine whether an authenticated user could access API resources belonging to another user by manipulating object-level identifiers. The assessment specifically focused on verifying whether the API enforced authoris</w:t>
-      </w:r>
-      <w:r>
-        <w:rPr>
-          <w:rFonts w:hint="default"/>
-          <w:highlight w:val="yellow"/>
-          <w:lang w:val="en-US"/>
-        </w:rPr>
-        <w:t>ation checks on individual resources after authentication.</w:t>
-      </w:r>
-    </w:p>
-    <w:p>
-      <w:pPr>
-        <w:rPr>
-          <w:rFonts w:hint="default"/>
-          <w:lang w:val="en-US"/>
-        </w:rPr>
-      </w:pPr>
+          <w:lang w:val="en-US"/>
+        </w:rPr>
+      </w:pPr>
+      <w:r>
+        <w:rPr>
+          <w:rFonts w:hint="default"/>
+          <w:lang w:val="en-US"/>
+        </w:rPr>
+        <w:t xml:space="preserve">The objective of this assessment was to determine whether a user can perform administrative actions by manipulating API endpoints. </w:t>
+      </w:r>
     </w:p>
     <w:p>
       <w:pPr>
@@ -410,7 +383,7 @@
           <w:rFonts w:hint="default"/>
           <w:lang w:val="en-US"/>
         </w:rPr>
-        <w:t>The BOLA vulnerability exploited on crAPI was done by gaining unauthorised access to other Users’ Mechanic Reports. These reports contained significant records of PII like phone numbers, emails, and VIN (Vehicle Identification Number). The API endpoint handles access control poorly by determining which mechanic report to display based solely on a sequential ID parameter passed in the URL path, failing to verify whether the authenticated user owns that specific resource.</w:t>
+        <w:t>An authenticated, low-privilege user can abuse an administrative endpoint to delete video files belonging to any other platform user. Initially, unauthorized deletion attempts returned a verbose error message leaking hidden internal API routing components. Because the back-end fails to validate user roles on administrative functions, standard users can invoke this hidden path to perform restricted, highly destructive actions (Vertical Privilege Escalation).</w:t>
       </w:r>
     </w:p>
     <w:p>
@@ -815,6 +788,14 @@
       </w:tblGrid>
       <w:tr>
         <w:tblPrEx>
+          <w:tblBorders>
+            <w:top w:val="single" w:color="auto" w:sz="4" w:space="0"/>
+            <w:left w:val="single" w:color="auto" w:sz="4" w:space="0"/>
+            <w:bottom w:val="single" w:color="auto" w:sz="4" w:space="0"/>
+            <w:right w:val="single" w:color="auto" w:sz="4" w:space="0"/>
+            <w:insideH w:val="single" w:color="auto" w:sz="4" w:space="0"/>
+            <w:insideV w:val="single" w:color="auto" w:sz="4" w:space="0"/>
+          </w:tblBorders>
           <w:tblCellMar>
             <w:top w:w="0" w:type="dxa"/>
             <w:left w:w="108" w:type="dxa"/>
@@ -1021,7 +1002,7 @@
                 <w:color w:val="000000"/>
                 <w:lang w:val="en-US" w:eastAsia="zh-CN"/>
               </w:rPr>
-              <w:t>8.5</w:t>
+              <w:t>8.1</w:t>
             </w:r>
           </w:p>
         </w:tc>
@@ -1050,7 +1031,7 @@
                 <w:color w:val="000000"/>
                 <w:lang w:val="en-US" w:eastAsia="zh-CN"/>
               </w:rPr>
-              <w:t>CWE-639: IDOR / BOLA</w:t>
+              <w:t>CWE-285: BFLA</w:t>
             </w:r>
           </w:p>
         </w:tc>
@@ -1075,11 +1056,9 @@
             <w:r>
               <w:rPr>
                 <w:rFonts w:hint="default"/>
-                <w:b w:val="0"/>
-                <w:color w:val="000000"/>
                 <w:lang w:val="en-US" w:eastAsia="zh-CN"/>
               </w:rPr>
-              <w:t>GET /workshop/api/merchant/contact_mechanic/{{id}}</w:t>
+              <w:t>DELETE /identity/api/v2/admin/videos/{{video_id}}</w:t>
             </w:r>
           </w:p>
         </w:tc>
@@ -1104,6 +1083,75 @@
     <w:p>
       <w:pPr>
         <w:rPr>
+          <w:rFonts w:hint="default"/>
+          <w:b/>
+          <w:bCs/>
+          <w:lang w:val="en-US"/>
+        </w:rPr>
+      </w:pPr>
+      <w:r>
+        <w:rPr>
+          <w:rFonts w:hint="default"/>
+          <w:b/>
+          <w:bCs/>
+          <w:lang w:val="en-US"/>
+        </w:rPr>
+        <w:t xml:space="preserve"> </w:t>
+      </w:r>
+    </w:p>
+    <w:p>
+      <w:pPr>
+        <w:rPr>
+          <w:rFonts w:hint="default"/>
+          <w:b/>
+          <w:bCs/>
+          <w:lang w:val="en-US"/>
+        </w:rPr>
+      </w:pPr>
+    </w:p>
+    <w:p>
+      <w:pPr>
+        <w:rPr>
+          <w:rFonts w:hint="default"/>
+          <w:b/>
+          <w:bCs/>
+          <w:lang w:val="en-US"/>
+        </w:rPr>
+      </w:pPr>
+    </w:p>
+    <w:p>
+      <w:pPr>
+        <w:rPr>
+          <w:rFonts w:hint="default"/>
+          <w:b/>
+          <w:bCs/>
+          <w:lang w:val="en-US"/>
+        </w:rPr>
+      </w:pPr>
+    </w:p>
+    <w:p>
+      <w:pPr>
+        <w:rPr>
+          <w:rFonts w:hint="default"/>
+          <w:b/>
+          <w:bCs/>
+          <w:lang w:val="en-US"/>
+        </w:rPr>
+      </w:pPr>
+    </w:p>
+    <w:p>
+      <w:pPr>
+        <w:rPr>
+          <w:rFonts w:hint="default"/>
+          <w:b/>
+          <w:bCs/>
+          <w:lang w:val="en-US"/>
+        </w:rPr>
+      </w:pPr>
+    </w:p>
+    <w:p>
+      <w:pPr>
+        <w:rPr>
           <w:rStyle w:val="23"/>
           <w:rFonts w:hint="default"/>
           <w:lang w:val="en-US"/>
@@ -1111,15 +1159,6 @@
       </w:pPr>
       <w:r>
         <w:rPr>
-          <w:rFonts w:hint="default"/>
-          <w:b/>
-          <w:bCs/>
-          <w:lang w:val="en-US"/>
-        </w:rPr>
-        <w:t xml:space="preserve"> </w:t>
-      </w:r>
-      <w:r>
-        <w:rPr>
           <w:rStyle w:val="23"/>
           <w:rFonts w:hint="default"/>
           <w:lang w:val="en-US"/>
@@ -1152,71 +1191,71 @@
           <w:bCs/>
           <w:lang w:val="en-US"/>
         </w:rPr>
-        <w:t>HIGH (Severe Data Exposure)</w:t>
-      </w:r>
-    </w:p>
-    <w:p>
-      <w:pPr>
-        <w:rPr>
-          <w:rFonts w:hint="default"/>
-          <w:lang w:val="en-US"/>
-        </w:rPr>
-      </w:pPr>
-    </w:p>
-    <w:p>
-      <w:pPr>
-        <w:rPr>
-          <w:rFonts w:hint="default"/>
-          <w:lang w:val="en-US"/>
-        </w:rPr>
-      </w:pPr>
-      <w:r>
-        <w:rPr>
-          <w:rFonts w:hint="default"/>
-          <w:b/>
-          <w:bCs/>
-          <w:lang w:val="en-US"/>
-        </w:rPr>
-        <w:t>Confidentiality:</w:t>
-      </w:r>
-      <w:r>
-        <w:rPr>
-          <w:rFonts w:hint="default"/>
-          <w:lang w:val="en-US"/>
-        </w:rPr>
-        <w:t xml:space="preserve"> Bypassing this authorisation barrier results in a total loss of confidentiality for the affected resources. An attacker gains access to restricted Personally Identifiable Information (PII), asset identifiers, and private records.</w:t>
-      </w:r>
-    </w:p>
-    <w:p>
-      <w:pPr>
-        <w:rPr>
-          <w:rFonts w:hint="default"/>
-          <w:lang w:val="en-US"/>
-        </w:rPr>
-      </w:pPr>
-    </w:p>
-    <w:p>
-      <w:pPr>
-        <w:rPr>
-          <w:rFonts w:hint="default"/>
-          <w:lang w:val="en-US"/>
-        </w:rPr>
-      </w:pPr>
-      <w:r>
-        <w:rPr>
-          <w:rFonts w:hint="default"/>
-          <w:b/>
-          <w:bCs/>
-          <w:lang w:val="en-US"/>
-        </w:rPr>
-        <w:t>Integrity &amp; Availability:</w:t>
-      </w:r>
-      <w:r>
-        <w:rPr>
-          <w:rFonts w:hint="default"/>
-          <w:lang w:val="en-US"/>
-        </w:rPr>
-        <w:t xml:space="preserve"> While this specific read-only endpoint does not allow an attacker to modify and read data directly, the scope of information gathered can easily be weaponised for secondary social engineering or targeted phishing attacks.</w:t>
+        <w:t>HIGH (Destructive Integrity Loss)</w:t>
+      </w:r>
+    </w:p>
+    <w:p>
+      <w:pPr>
+        <w:rPr>
+          <w:rFonts w:hint="default"/>
+          <w:lang w:val="en-US"/>
+        </w:rPr>
+      </w:pPr>
+    </w:p>
+    <w:p>
+      <w:pPr>
+        <w:rPr>
+          <w:rFonts w:hint="default"/>
+          <w:lang w:val="en-US"/>
+        </w:rPr>
+      </w:pPr>
+      <w:r>
+        <w:rPr>
+          <w:rFonts w:hint="default"/>
+          <w:b/>
+          <w:bCs/>
+          <w:lang w:val="en-US"/>
+        </w:rPr>
+        <w:t>Availability:</w:t>
+      </w:r>
+      <w:r>
+        <w:rPr>
+          <w:rFonts w:hint="default"/>
+          <w:lang w:val="en-US"/>
+        </w:rPr>
+        <w:t xml:space="preserve"> High. By deleting video assets belonging to other users, the attacker directly destroys the availability of those resources for legitimate customers, disrupting core platform services.</w:t>
+      </w:r>
+    </w:p>
+    <w:p>
+      <w:pPr>
+        <w:rPr>
+          <w:rFonts w:hint="default"/>
+          <w:lang w:val="en-US"/>
+        </w:rPr>
+      </w:pPr>
+    </w:p>
+    <w:p>
+      <w:pPr>
+        <w:rPr>
+          <w:rFonts w:hint="default"/>
+          <w:lang w:val="en-US"/>
+        </w:rPr>
+      </w:pPr>
+      <w:r>
+        <w:rPr>
+          <w:rFonts w:hint="default"/>
+          <w:b/>
+          <w:bCs/>
+          <w:lang w:val="en-US"/>
+        </w:rPr>
+        <w:t>Integrity:</w:t>
+      </w:r>
+      <w:r>
+        <w:rPr>
+          <w:rFonts w:hint="default"/>
+          <w:lang w:val="en-US"/>
+        </w:rPr>
+        <w:t xml:space="preserve"> Threat actors can target specific competitors or randomly delete system data, resulting in irreversible data loss for legitimate customers.</w:t>
       </w:r>
     </w:p>
     <w:p>
@@ -1248,7 +1287,7 @@
           <w:rFonts w:hint="default"/>
           <w:lang w:val="en-US"/>
         </w:rPr>
-        <w:t xml:space="preserve">This section would contain the step by step process to which this BOLA vulnerability was exploited on crAPI. It would also contain screenshots from the lab to provide better understanding of the processes executed. These steps were carried out after creation of user </w:t>
+        <w:t xml:space="preserve">This section would contain the step by step process to which this BFLA vulnerability was exploited on crAPI. It would also contain screenshots from the lab to provide better understanding of the processes executed. These steps were carried out after creation of users </w:t>
       </w:r>
       <w:r>
         <w:rPr>
@@ -1268,15 +1307,33 @@
           <w:u w:val="none"/>
           <w:lang w:val="en-US"/>
         </w:rPr>
-        <w:t>alice123@email.com</w:t>
-      </w:r>
-      <w:r>
-        <w:rPr>
-          <w:rFonts w:hint="default"/>
+        <w:t>alice123@email.com”</w:t>
+      </w:r>
+      <w:r>
+        <w:rPr>
+          <w:rFonts w:hint="default"/>
+          <w:lang w:val="en-US"/>
+        </w:rPr>
+        <w:t xml:space="preserve"> and </w:t>
+      </w:r>
+      <w:r>
+        <w:rPr>
+          <w:rFonts w:hint="default"/>
+          <w:i/>
+          <w:iCs/>
           <w:color w:val="auto"/>
           <w:u w:val="none"/>
           <w:lang w:val="en-US"/>
         </w:rPr>
+        <w:t xml:space="preserve"> “john123@email.com</w:t>
+      </w:r>
+      <w:r>
+        <w:rPr>
+          <w:rFonts w:hint="default"/>
+          <w:color w:val="auto"/>
+          <w:u w:val="none"/>
+          <w:lang w:val="en-US"/>
+        </w:rPr>
         <w:t>”</w:t>
       </w:r>
       <w:r>
@@ -1284,7 +1341,7 @@
           <w:rFonts w:hint="default"/>
           <w:lang w:val="en-US"/>
         </w:rPr>
-        <w:t xml:space="preserve"> on crAPI. </w:t>
+        <w:t xml:space="preserve"> on crAPI.</w:t>
       </w:r>
     </w:p>
     <w:p>
@@ -1309,22 +1366,22 @@
           <w:rFonts w:hint="default"/>
           <w:lang w:val="en-US"/>
         </w:rPr>
-        <w:t>STEP 1 - Login &amp; acquire valid Session Token to capture requests</w:t>
-      </w:r>
-    </w:p>
-    <w:p>
-      <w:pPr>
-        <w:rPr>
-          <w:rFonts w:hint="default"/>
-          <w:lang w:val="en-US"/>
-        </w:rPr>
-      </w:pPr>
-      <w:r>
-        <w:rPr>
-          <w:rFonts w:hint="default"/>
-          <w:lang w:val="en-US"/>
-        </w:rPr>
-        <w:t xml:space="preserve">After creating a user and logging in to acquire a valid session token </w:t>
+        <w:t xml:space="preserve">STEP 1 - Video Creation and Name update </w:t>
+      </w:r>
+    </w:p>
+    <w:p>
+      <w:pPr>
+        <w:rPr>
+          <w:rFonts w:hint="default"/>
+          <w:lang w:val="en-US"/>
+        </w:rPr>
+      </w:pPr>
+      <w:r>
+        <w:rPr>
+          <w:rFonts w:hint="default"/>
+          <w:lang w:val="en-US"/>
+        </w:rPr>
+        <w:t xml:space="preserve">After creation of the John123’s account, a video was uploaded to the profile </w:t>
       </w:r>
       <w:r>
         <w:rPr>
@@ -1340,7 +1397,39 @@
           <w:rFonts w:hint="default"/>
           <w:lang w:val="en-US"/>
         </w:rPr>
-        <w:t xml:space="preserve">, it was possible to initiate and capture requests from crAPI to Postman </w:t>
+        <w:t>. An unauthorised attempt to update the video’s name from Alice123’s account was initiated. Unsuccessful, the video name was updated on Alice123’s account instead (this was noticed as the “video_id” received in the response(</w:t>
+      </w:r>
+      <w:r>
+        <w:rPr>
+          <w:rFonts w:hint="default"/>
+          <w:b/>
+          <w:bCs/>
+          <w:lang w:val="en-US"/>
+        </w:rPr>
+        <w:t>id: 52</w:t>
+      </w:r>
+      <w:r>
+        <w:rPr>
+          <w:rFonts w:hint="default"/>
+          <w:lang w:val="en-US"/>
+        </w:rPr>
+        <w:t>) was different to that of the target(</w:t>
+      </w:r>
+      <w:r>
+        <w:rPr>
+          <w:rFonts w:hint="default"/>
+          <w:b/>
+          <w:bCs/>
+          <w:lang w:val="en-US"/>
+        </w:rPr>
+        <w:t>id:102</w:t>
+      </w:r>
+      <w:r>
+        <w:rPr>
+          <w:rFonts w:hint="default"/>
+          <w:lang w:val="en-US"/>
+        </w:rPr>
+        <w:t>))</w:t>
       </w:r>
       <w:r>
         <w:rPr>
@@ -1356,34 +1445,39 @@
           <w:rFonts w:hint="default"/>
           <w:lang w:val="en-US"/>
         </w:rPr>
-        <w:t xml:space="preserve"> by intercepting traffic while using the website as intended. Doing this would make it possible to discover endpoints that would be susceptible to a possible BOLA attack. </w:t>
-      </w:r>
-    </w:p>
-    <w:p>
-      <w:pPr>
-        <w:rPr>
-          <w:rFonts w:hint="default"/>
-          <w:lang w:val="en-US"/>
-        </w:rPr>
-      </w:pPr>
-    </w:p>
-    <w:p>
-      <w:pPr>
-        <w:rPr>
-          <w:rFonts w:hint="default"/>
-          <w:lang w:val="en-US"/>
-        </w:rPr>
-      </w:pPr>
-      <w:r>
-        <w:rPr>
-          <w:rFonts w:hint="default"/>
+        <w:t xml:space="preserve">. </w:t>
+      </w:r>
+    </w:p>
+    <w:p>
+      <w:pPr>
+        <w:rPr>
+          <w:rFonts w:hint="default"/>
+          <w:lang w:val="en-US"/>
+        </w:rPr>
+      </w:pPr>
+    </w:p>
+    <w:p>
+      <w:pPr>
+        <w:pStyle w:val="11"/>
+        <w:rPr>
+          <w:rFonts w:hint="default"/>
+          <w:b/>
+          <w:bCs/>
+          <w:lang w:val="en-US"/>
+        </w:rPr>
+      </w:pPr>
+      <w:r>
+        <w:rPr>
+          <w:rFonts w:hint="default"/>
+          <w:b/>
+          <w:bCs/>
           <w:lang w:val="en-US"/>
         </w:rPr>
         <w:drawing>
           <wp:inline distT="0" distB="0" distL="114300" distR="114300">
-            <wp:extent cx="5273040" cy="2714625"/>
-            <wp:effectExtent l="0" t="0" r="10160" b="3175"/>
-            <wp:docPr id="7" name="Picture 7" descr="crAPI Login Token 2026-09-07 144251"/>
+            <wp:extent cx="5273675" cy="2879090"/>
+            <wp:effectExtent l="0" t="0" r="9525" b="3810"/>
+            <wp:docPr id="1" name="Picture 1" descr="John videoName update 2026-09-17 103235"/>
             <wp:cNvGraphicFramePr>
               <a:graphicFrameLocks xmlns:a="http://schemas.openxmlformats.org/drawingml/2006/main" noChangeAspect="1"/>
             </wp:cNvGraphicFramePr>
@@ -1391,7 +1485,7 @@
               <a:graphicData uri="http://schemas.openxmlformats.org/drawingml/2006/picture">
                 <pic:pic xmlns:pic="http://schemas.openxmlformats.org/drawingml/2006/picture">
                   <pic:nvPicPr>
-                    <pic:cNvPr id="7" name="Picture 7" descr="crAPI Login Token 2026-09-07 144251"/>
+                    <pic:cNvPr id="1" name="Picture 1" descr="John videoName update 2026-09-17 103235"/>
                     <pic:cNvPicPr>
                       <a:picLocks noChangeAspect="1"/>
                     </pic:cNvPicPr>
@@ -1405,7 +1499,7 @@
                   <pic:spPr>
                     <a:xfrm>
                       <a:off x="0" y="0"/>
-                      <a:ext cx="5273040" cy="2714625"/>
+                      <a:ext cx="5273675" cy="2879090"/>
                     </a:xfrm>
                     <a:prstGeom prst="rect">
                       <a:avLst/>
@@ -1478,6 +1572,14 @@
           <w:lang w:val="en-US"/>
         </w:rPr>
       </w:pPr>
+    </w:p>
+    <w:p>
+      <w:pPr>
+        <w:rPr>
+          <w:rFonts w:hint="default"/>
+          <w:lang w:val="en-US"/>
+        </w:rPr>
+      </w:pPr>
       <w:r>
         <w:rPr>
           <w:rFonts w:hint="default"/>
@@ -1485,9 +1587,9 @@
         </w:rPr>
         <w:drawing>
           <wp:inline distT="0" distB="0" distL="114300" distR="114300">
-            <wp:extent cx="5269230" cy="2689860"/>
-            <wp:effectExtent l="0" t="0" r="1270" b="2540"/>
-            <wp:docPr id="5" name="Picture 5" descr="crAPI workshop requests 2026-09-07 152452"/>
+            <wp:extent cx="5273675" cy="2856865"/>
+            <wp:effectExtent l="0" t="0" r="9525" b="635"/>
+            <wp:docPr id="5" name="Picture 5" descr="Updates Alice's  video name 2026-09-17 103843"/>
             <wp:cNvGraphicFramePr>
               <a:graphicFrameLocks xmlns:a="http://schemas.openxmlformats.org/drawingml/2006/main" noChangeAspect="1"/>
             </wp:cNvGraphicFramePr>
@@ -1495,7 +1597,7 @@
               <a:graphicData uri="http://schemas.openxmlformats.org/drawingml/2006/picture">
                 <pic:pic xmlns:pic="http://schemas.openxmlformats.org/drawingml/2006/picture">
                   <pic:nvPicPr>
-                    <pic:cNvPr id="5" name="Picture 5" descr="crAPI workshop requests 2026-09-07 152452"/>
+                    <pic:cNvPr id="5" name="Picture 5" descr="Updates Alice's  video name 2026-09-17 103843"/>
                     <pic:cNvPicPr>
                       <a:picLocks noChangeAspect="1"/>
                     </pic:cNvPicPr>
@@ -1509,7 +1611,7 @@
                   <pic:spPr>
                     <a:xfrm>
                       <a:off x="0" y="0"/>
-                      <a:ext cx="5269230" cy="2689860"/>
+                      <a:ext cx="5273675" cy="2856865"/>
                     </a:xfrm>
                     <a:prstGeom prst="rect">
                       <a:avLst/>
@@ -1526,10 +1628,8 @@
       <w:pPr>
         <w:pStyle w:val="11"/>
         <w:rPr>
-          <w:rFonts w:hint="default"/>
-          <w:b/>
-          <w:bCs/>
-          <w:lang w:val="en-US"/>
+          <w:b/>
+          <w:bCs/>
         </w:rPr>
       </w:pPr>
       <w:r>
@@ -1574,14 +1674,6 @@
         </w:rPr>
         <w:fldChar w:fldCharType="end"/>
       </w:r>
-    </w:p>
-    <w:p>
-      <w:pPr>
-        <w:rPr>
-          <w:rFonts w:hint="default"/>
-          <w:lang w:val="en-US"/>
-        </w:rPr>
-      </w:pPr>
     </w:p>
     <w:p>
       <w:pPr>
@@ -1605,13 +1697,15 @@
           <w:rFonts w:hint="default"/>
           <w:lang w:val="en-US"/>
         </w:rPr>
-        <w:t>STEP 2 - Identify &amp; Modifying the Request</w:t>
-      </w:r>
-    </w:p>
-    <w:p>
-      <w:pPr>
-        <w:rPr>
-          <w:rFonts w:hint="default"/>
+        <w:t>STEP 2 - Reconnaisance via Verbose Error Message</w:t>
+      </w:r>
+    </w:p>
+    <w:p>
+      <w:pPr>
+        <w:rPr>
+          <w:rFonts w:hint="default"/>
+          <w:b/>
+          <w:bCs/>
           <w:i w:val="0"/>
           <w:iCs w:val="0"/>
           <w:lang w:val="en-US"/>
@@ -1620,25 +1714,11 @@
       <w:r>
         <w:rPr>
           <w:rFonts w:hint="default"/>
-          <w:lang w:val="en-US"/>
-        </w:rPr>
-        <w:t xml:space="preserve">The intercepted request was sent to Burp Repeater </w:t>
-      </w:r>
-      <w:r>
-        <w:rPr>
-          <w:rFonts w:hint="default"/>
-          <w:b/>
-          <w:bCs/>
-          <w:lang w:val="en-US"/>
-        </w:rPr>
-        <w:t>(Figure 3)</w:t>
-      </w:r>
-      <w:r>
-        <w:rPr>
-          <w:rFonts w:hint="default"/>
-          <w:lang w:val="en-US"/>
-        </w:rPr>
-        <w:t xml:space="preserve"> and a </w:t>
+          <w:i w:val="0"/>
+          <w:iCs w:val="0"/>
+          <w:lang w:val="en-US"/>
+        </w:rPr>
+        <w:t xml:space="preserve">With the </w:t>
       </w:r>
       <w:r>
         <w:rPr>
@@ -1647,132 +1727,190 @@
           <w:iCs/>
           <w:lang w:val="en-US"/>
         </w:rPr>
-        <w:t xml:space="preserve">200 </w:t>
-      </w:r>
-      <w:r>
-        <w:rPr>
-          <w:rFonts w:hint="default"/>
-          <w:lang w:val="en-US"/>
-        </w:rPr>
-        <w:t xml:space="preserve">response was received with a report link. This URL link was then used to replace the initial POST request and construct a </w:t>
-      </w:r>
-      <w:r>
-        <w:rPr>
-          <w:rFonts w:hint="default"/>
+        <w:t xml:space="preserve">“PUT” </w:t>
+      </w:r>
+      <w:r>
+        <w:rPr>
+          <w:rFonts w:hint="default"/>
+          <w:i w:val="0"/>
+          <w:iCs w:val="0"/>
+          <w:lang w:val="en-US"/>
+        </w:rPr>
+        <w:t xml:space="preserve">request being unsuccessful, a “DELETE” request was performed on John123’s video </w:t>
+      </w:r>
+      <w:r>
+        <w:rPr>
+          <w:rFonts w:hint="default"/>
+          <w:b/>
+          <w:bCs/>
+          <w:i w:val="0"/>
+          <w:iCs w:val="0"/>
+          <w:lang w:val="en-US"/>
+        </w:rPr>
+        <w:t>(Figure 3).</w:t>
+      </w:r>
+    </w:p>
+    <w:p>
+      <w:pPr>
+        <w:rPr>
+          <w:rFonts w:hint="default"/>
+          <w:b/>
+          <w:bCs/>
+          <w:i w:val="0"/>
+          <w:iCs w:val="0"/>
+          <w:lang w:val="en-US"/>
+        </w:rPr>
+      </w:pPr>
+    </w:p>
+    <w:p>
+      <w:pPr>
+        <w:rPr>
+          <w:rFonts w:hint="default"/>
+          <w:b w:val="0"/>
+          <w:bCs w:val="0"/>
+          <w:i w:val="0"/>
+          <w:iCs w:val="0"/>
+          <w:lang w:val="en-US"/>
+        </w:rPr>
+      </w:pPr>
+      <w:r>
+        <w:rPr>
+          <w:rFonts w:hint="default"/>
+          <w:b/>
+          <w:bCs/>
+          <w:i w:val="0"/>
+          <w:iCs w:val="0"/>
+          <w:lang w:val="en-US"/>
+        </w:rPr>
+        <w:t xml:space="preserve"> </w:t>
+      </w:r>
+      <w:r>
+        <w:rPr>
+          <w:rFonts w:hint="default"/>
+          <w:b w:val="0"/>
+          <w:bCs w:val="0"/>
+          <w:i w:val="0"/>
+          <w:iCs w:val="0"/>
+          <w:lang w:val="en-US"/>
+        </w:rPr>
+        <w:t xml:space="preserve">Although unsuccessful, a </w:t>
+      </w:r>
+      <w:r>
+        <w:rPr>
+          <w:rFonts w:hint="default"/>
+          <w:b w:val="0"/>
+          <w:bCs w:val="0"/>
           <w:i/>
           <w:iCs/>
           <w:lang w:val="en-US"/>
         </w:rPr>
-        <w:t xml:space="preserve">GET </w:t>
-      </w:r>
-      <w:r>
-        <w:rPr>
-          <w:rFonts w:hint="default"/>
+        <w:t xml:space="preserve">403 Forbidden </w:t>
+      </w:r>
+      <w:r>
+        <w:rPr>
+          <w:rFonts w:hint="default"/>
+          <w:b w:val="0"/>
+          <w:bCs w:val="0"/>
           <w:i w:val="0"/>
           <w:iCs w:val="0"/>
           <w:lang w:val="en-US"/>
         </w:rPr>
-        <w:t xml:space="preserve">request </w:t>
-      </w:r>
-      <w:r>
-        <w:rPr>
-          <w:rFonts w:hint="default"/>
-          <w:b/>
-          <w:bCs/>
+        <w:t>response containing a verbose error string (</w:t>
+      </w:r>
+      <w:r>
+        <w:rPr>
+          <w:rFonts w:hint="default"/>
+          <w:b w:val="0"/>
+          <w:bCs w:val="0"/>
+          <w:i/>
+          <w:iCs/>
+          <w:lang w:val="en-US"/>
+        </w:rPr>
+        <w:t xml:space="preserve">“This is an admin function. Try to access the admin API”) </w:t>
+      </w:r>
+      <w:r>
+        <w:rPr>
+          <w:rFonts w:hint="default"/>
+          <w:b w:val="0"/>
+          <w:bCs w:val="0"/>
           <w:i w:val="0"/>
           <w:iCs w:val="0"/>
           <w:lang w:val="en-US"/>
         </w:rPr>
-        <w:t>(Figure 4)</w:t>
-      </w:r>
-      <w:r>
-        <w:rPr>
-          <w:rFonts w:hint="default"/>
+        <w:t xml:space="preserve">gave hints on a way to bypass authentication </w:t>
+      </w:r>
+      <w:r>
+        <w:rPr>
+          <w:rFonts w:hint="default"/>
+          <w:b/>
+          <w:bCs/>
           <w:i w:val="0"/>
           <w:iCs w:val="0"/>
           <w:lang w:val="en-US"/>
         </w:rPr>
-        <w:t>. This request delivered a valid response with the user’s mechanic report details. Having seen this, The sequential integer identifier at the end of the URL string is manually changed</w:t>
-      </w:r>
-      <w:r>
-        <w:rPr>
-          <w:rFonts w:hint="default"/>
+        <w:t>(Figure 3)</w:t>
+      </w:r>
+      <w:r>
+        <w:rPr>
+          <w:rFonts w:hint="default"/>
+          <w:b w:val="0"/>
+          <w:bCs w:val="0"/>
           <w:i w:val="0"/>
           <w:iCs w:val="0"/>
-        </w:rPr>
-        <w:t xml:space="preserve"> </w:t>
-      </w:r>
-      <w:r>
-        <w:rPr>
-          <w:rFonts w:hint="default"/>
+          <w:lang w:val="en-US"/>
+        </w:rPr>
+        <w:t xml:space="preserve">. </w:t>
+      </w:r>
+    </w:p>
+    <w:p>
+      <w:pPr>
+        <w:rPr>
+          <w:rFonts w:hint="default"/>
+          <w:b/>
+          <w:bCs/>
           <w:i w:val="0"/>
           <w:iCs w:val="0"/>
           <w:lang w:val="en-US"/>
         </w:rPr>
-        <w:t xml:space="preserve">from </w:t>
-      </w:r>
-      <w:r>
-        <w:rPr>
-          <w:rFonts w:hint="default"/>
+      </w:pPr>
+    </w:p>
+    <w:p>
+      <w:pPr>
+        <w:rPr>
+          <w:rFonts w:hint="default"/>
+          <w:b/>
+          <w:bCs/>
           <w:i w:val="0"/>
           <w:iCs w:val="0"/>
-        </w:rPr>
-        <w:t xml:space="preserve">11 </w:t>
-      </w:r>
-      <w:r>
-        <w:rPr>
-          <w:rFonts w:hint="default"/>
+          <w:lang w:val="en-US"/>
+        </w:rPr>
+      </w:pPr>
+    </w:p>
+    <w:p>
+      <w:pPr>
+        <w:rPr>
+          <w:rFonts w:hint="default"/>
+          <w:b/>
+          <w:bCs/>
           <w:i w:val="0"/>
           <w:iCs w:val="0"/>
           <w:lang w:val="en-US"/>
         </w:rPr>
-        <w:t xml:space="preserve">to </w:t>
-      </w:r>
-      <w:r>
-        <w:rPr>
-          <w:rFonts w:hint="default"/>
+      </w:pPr>
+      <w:r>
+        <w:rPr>
+          <w:rFonts w:hint="default"/>
+          <w:b/>
+          <w:bCs/>
           <w:i w:val="0"/>
           <w:iCs w:val="0"/>
-        </w:rPr>
-        <w:t xml:space="preserve">1 </w:t>
-      </w:r>
-      <w:r>
-        <w:rPr>
-          <w:rFonts w:hint="default"/>
-          <w:i w:val="0"/>
-          <w:iCs w:val="0"/>
-          <w:lang w:val="en-US"/>
-        </w:rPr>
-        <w:t>to attempt access to an unauthorized object resource.</w:t>
-      </w:r>
-    </w:p>
-    <w:p>
-      <w:pPr>
-        <w:rPr>
-          <w:rFonts w:hint="default"/>
-          <w:i w:val="0"/>
-          <w:iCs w:val="0"/>
-          <w:lang w:val="en-US"/>
-        </w:rPr>
-      </w:pPr>
-    </w:p>
-    <w:p>
-      <w:pPr>
-        <w:rPr>
-          <w:rFonts w:hint="default"/>
-          <w:lang w:val="en-US"/>
-        </w:rPr>
-      </w:pPr>
-      <w:r>
-        <w:rPr>
-          <w:rFonts w:hint="default"/>
           <w:lang w:val="en-US"/>
         </w:rPr>
         <w:drawing>
           <wp:inline distT="0" distB="0" distL="114300" distR="114300">
-            <wp:extent cx="5274310" cy="2840355"/>
-            <wp:effectExtent l="0" t="0" r="8890" b="4445"/>
-            <wp:docPr id="10" name="Picture 10" descr="repeater request 2026-09-10 140835"/>
+            <wp:extent cx="5269230" cy="2665095"/>
+            <wp:effectExtent l="0" t="0" r="1270" b="1905"/>
+            <wp:docPr id="6" name="Picture 6" descr="DELETE John video from Alice 2026-09-17 104141"/>
             <wp:cNvGraphicFramePr>
               <a:graphicFrameLocks xmlns:a="http://schemas.openxmlformats.org/drawingml/2006/main" noChangeAspect="1"/>
             </wp:cNvGraphicFramePr>
@@ -1780,7 +1918,7 @@
               <a:graphicData uri="http://schemas.openxmlformats.org/drawingml/2006/picture">
                 <pic:pic xmlns:pic="http://schemas.openxmlformats.org/drawingml/2006/picture">
                   <pic:nvPicPr>
-                    <pic:cNvPr id="10" name="Picture 10" descr="repeater request 2026-09-10 140835"/>
+                    <pic:cNvPr id="6" name="Picture 6" descr="DELETE John video from Alice 2026-09-17 104141"/>
                     <pic:cNvPicPr>
                       <a:picLocks noChangeAspect="1"/>
                     </pic:cNvPicPr>
@@ -1794,7 +1932,7 @@
                   <pic:spPr>
                     <a:xfrm>
                       <a:off x="0" y="0"/>
-                      <a:ext cx="5274310" cy="2840355"/>
+                      <a:ext cx="5269230" cy="2665095"/>
                     </a:xfrm>
                     <a:prstGeom prst="rect">
                       <a:avLst/>
@@ -1814,6 +1952,8 @@
           <w:rFonts w:hint="default"/>
           <w:b/>
           <w:bCs/>
+          <w:i w:val="0"/>
+          <w:iCs w:val="0"/>
           <w:lang w:val="en-US"/>
         </w:rPr>
       </w:pPr>
@@ -1867,6 +2007,88 @@
           <w:lang w:val="en-US"/>
         </w:rPr>
       </w:pPr>
+    </w:p>
+    <w:p>
+      <w:pPr>
+        <w:pStyle w:val="8"/>
+        <w:bidi w:val="0"/>
+        <w:rPr>
+          <w:rFonts w:hint="default"/>
+        </w:rPr>
+      </w:pPr>
+      <w:r>
+        <w:rPr>
+          <w:rFonts w:hint="default"/>
+          <w:lang w:val="en-US"/>
+        </w:rPr>
+        <w:t>STEP 3</w:t>
+      </w:r>
+      <w:r>
+        <w:rPr>
+          <w:rFonts w:hint="default"/>
+        </w:rPr>
+        <w:t xml:space="preserve"> - Request Reconstruction </w:t>
+      </w:r>
+    </w:p>
+    <w:p>
+      <w:pPr>
+        <w:rPr>
+          <w:rFonts w:hint="default"/>
+          <w:lang w:val="en-US"/>
+        </w:rPr>
+      </w:pPr>
+      <w:r>
+        <w:rPr>
+          <w:rFonts w:hint="default"/>
+          <w:lang w:val="en-US"/>
+        </w:rPr>
+        <w:t xml:space="preserve">Based on the hint from the error message, the URI path was modified pattern while having a standard user’s token (Alice’s). The new DELETE request replaces the </w:t>
+      </w:r>
+      <w:r>
+        <w:rPr>
+          <w:rFonts w:hint="default"/>
+          <w:i/>
+          <w:iCs/>
+          <w:lang w:val="en-US"/>
+        </w:rPr>
+        <w:t>v2/user/</w:t>
+      </w:r>
+      <w:r>
+        <w:rPr>
+          <w:rFonts w:hint="default"/>
+          <w:lang w:val="en-US"/>
+        </w:rPr>
+        <w:t xml:space="preserve"> endpoint with </w:t>
+      </w:r>
+      <w:r>
+        <w:rPr>
+          <w:rFonts w:hint="default"/>
+          <w:i/>
+          <w:iCs/>
+          <w:lang w:val="en-US"/>
+        </w:rPr>
+        <w:t xml:space="preserve">v2/admin/ </w:t>
+      </w:r>
+      <w:r>
+        <w:rPr>
+          <w:rFonts w:hint="default"/>
+          <w:b/>
+          <w:bCs/>
+          <w:i w:val="0"/>
+          <w:iCs w:val="0"/>
+          <w:lang w:val="en-US"/>
+        </w:rPr>
+        <w:t>(Figure 4)</w:t>
+      </w:r>
+      <w:r>
+        <w:rPr>
+          <w:rFonts w:hint="default"/>
+          <w:i/>
+          <w:iCs/>
+          <w:lang w:val="en-US"/>
+        </w:rPr>
+        <w:t xml:space="preserve"> </w:t>
+      </w:r>
     </w:p>
     <w:p>
       <w:pPr>
@@ -1882,9 +2104,9 @@
         </w:rPr>
         <w:drawing>
           <wp:inline distT="0" distB="0" distL="114300" distR="114300">
-            <wp:extent cx="5268595" cy="2533015"/>
-            <wp:effectExtent l="0" t="0" r="1905" b="6985"/>
-            <wp:docPr id="9" name="Picture 9" descr="request id-eleven 2026-09-10 141016"/>
+            <wp:extent cx="5269230" cy="2871470"/>
+            <wp:effectExtent l="0" t="0" r="1270" b="11430"/>
+            <wp:docPr id="7" name="Picture 7" descr="BFLA exploited 2026-09-17 104309"/>
             <wp:cNvGraphicFramePr>
               <a:graphicFrameLocks xmlns:a="http://schemas.openxmlformats.org/drawingml/2006/main" noChangeAspect="1"/>
             </wp:cNvGraphicFramePr>
@@ -1892,7 +2114,7 @@
               <a:graphicData uri="http://schemas.openxmlformats.org/drawingml/2006/picture">
                 <pic:pic xmlns:pic="http://schemas.openxmlformats.org/drawingml/2006/picture">
                   <pic:nvPicPr>
-                    <pic:cNvPr id="9" name="Picture 9" descr="request id-eleven 2026-09-10 141016"/>
+                    <pic:cNvPr id="7" name="Picture 7" descr="BFLA exploited 2026-09-17 104309"/>
                     <pic:cNvPicPr>
                       <a:picLocks noChangeAspect="1"/>
                     </pic:cNvPicPr>
@@ -1906,7 +2128,7 @@
                   <pic:spPr>
                     <a:xfrm>
                       <a:off x="0" y="0"/>
-                      <a:ext cx="5268595" cy="2533015"/>
+                      <a:ext cx="5269230" cy="2871470"/>
                     </a:xfrm>
                     <a:prstGeom prst="rect">
                       <a:avLst/>
@@ -1982,342 +2204,6 @@
     </w:p>
     <w:p>
       <w:pPr>
-        <w:pStyle w:val="8"/>
-        <w:bidi w:val="0"/>
-        <w:rPr>
-          <w:rFonts w:hint="default"/>
-        </w:rPr>
-      </w:pPr>
-      <w:r>
-        <w:rPr>
-          <w:rFonts w:hint="default"/>
-          <w:lang w:val="en-US"/>
-        </w:rPr>
-        <w:t>STEP 3</w:t>
-      </w:r>
-      <w:r>
-        <w:rPr>
-          <w:rFonts w:hint="default"/>
-        </w:rPr>
-        <w:t xml:space="preserve"> - Unauthorised Data Leakage</w:t>
-      </w:r>
-    </w:p>
-    <w:p>
-      <w:pPr>
-        <w:rPr>
-          <w:rFonts w:hint="default"/>
-          <w:lang w:val="en-US"/>
-        </w:rPr>
-      </w:pPr>
-      <w:r>
-        <w:rPr>
-          <w:rFonts w:hint="default"/>
-        </w:rPr>
-        <w:t>The server responds with an HTTP 200 OK status code, completely bypassing authori</w:t>
-      </w:r>
-      <w:r>
-        <w:rPr>
-          <w:rFonts w:hint="default"/>
-          <w:lang w:val="en-US"/>
-        </w:rPr>
-        <w:t>s</w:t>
-      </w:r>
-      <w:r>
-        <w:rPr>
-          <w:rFonts w:hint="default"/>
-        </w:rPr>
-        <w:t>ation controls and leaking the vehicle data of an external user</w:t>
-      </w:r>
-      <w:r>
-        <w:rPr>
-          <w:rFonts w:hint="default"/>
-          <w:lang w:val="en-US"/>
-        </w:rPr>
-        <w:t xml:space="preserve"> </w:t>
-      </w:r>
-      <w:r>
-        <w:rPr>
-          <w:rFonts w:hint="default"/>
-          <w:b/>
-          <w:bCs/>
-          <w:lang w:val="en-US"/>
-        </w:rPr>
-        <w:t>(Figure 5)</w:t>
-      </w:r>
-      <w:r>
-        <w:rPr>
-          <w:rFonts w:hint="default"/>
-          <w:lang w:val="en-US"/>
-        </w:rPr>
-        <w:t xml:space="preserve">. This was also tested by changing the “report_id” from 1 to 3 </w:t>
-      </w:r>
-      <w:r>
-        <w:rPr>
-          <w:rFonts w:hint="default"/>
-          <w:b/>
-          <w:bCs/>
-          <w:lang w:val="en-US"/>
-        </w:rPr>
-        <w:t>(Figure 6)</w:t>
-      </w:r>
-      <w:r>
-        <w:rPr>
-          <w:rFonts w:hint="default"/>
-          <w:lang w:val="en-US"/>
-        </w:rPr>
-        <w:t xml:space="preserve">, thereby leaking more JSON metadata about another user. </w:t>
-      </w:r>
-    </w:p>
-    <w:p>
-      <w:pPr>
-        <w:rPr>
-          <w:rFonts w:hint="default"/>
-          <w:lang w:val="en-US"/>
-        </w:rPr>
-      </w:pPr>
-    </w:p>
-    <w:p>
-      <w:pPr>
-        <w:rPr>
-          <w:rFonts w:hint="default"/>
-          <w:lang w:val="en-US"/>
-        </w:rPr>
-      </w:pPr>
-      <w:r>
-        <w:rPr>
-          <w:rFonts w:hint="default"/>
-          <w:lang w:val="en-US"/>
-        </w:rPr>
-        <w:drawing>
-          <wp:inline distT="0" distB="0" distL="114300" distR="114300">
-            <wp:extent cx="5269230" cy="2532380"/>
-            <wp:effectExtent l="0" t="0" r="1270" b="7620"/>
-            <wp:docPr id="3" name="Picture 3" descr="BOLA exploit 2026-09-07 172619"/>
-            <wp:cNvGraphicFramePr>
-              <a:graphicFrameLocks xmlns:a="http://schemas.openxmlformats.org/drawingml/2006/main" noChangeAspect="1"/>
-            </wp:cNvGraphicFramePr>
-            <a:graphic xmlns:a="http://schemas.openxmlformats.org/drawingml/2006/main">
-              <a:graphicData uri="http://schemas.openxmlformats.org/drawingml/2006/picture">
-                <pic:pic xmlns:pic="http://schemas.openxmlformats.org/drawingml/2006/picture">
-                  <pic:nvPicPr>
-                    <pic:cNvPr id="3" name="Picture 3" descr="BOLA exploit 2026-09-07 172619"/>
-                    <pic:cNvPicPr>
-                      <a:picLocks noChangeAspect="1"/>
-                    </pic:cNvPicPr>
-                  </pic:nvPicPr>
-                  <pic:blipFill>
-                    <a:blip r:embed="rId9"/>
-                    <a:stretch>
-                      <a:fillRect/>
-                    </a:stretch>
-                  </pic:blipFill>
-                  <pic:spPr>
-                    <a:xfrm>
-                      <a:off x="0" y="0"/>
-                      <a:ext cx="5269230" cy="2532380"/>
-                    </a:xfrm>
-                    <a:prstGeom prst="rect">
-                      <a:avLst/>
-                    </a:prstGeom>
-                  </pic:spPr>
-                </pic:pic>
-              </a:graphicData>
-            </a:graphic>
-          </wp:inline>
-        </w:drawing>
-      </w:r>
-    </w:p>
-    <w:p>
-      <w:pPr>
-        <w:pStyle w:val="11"/>
-        <w:rPr>
-          <w:rFonts w:hint="default"/>
-          <w:b/>
-          <w:bCs/>
-          <w:lang w:val="en-US"/>
-        </w:rPr>
-      </w:pPr>
-      <w:r>
-        <w:rPr>
-          <w:b/>
-          <w:bCs/>
-        </w:rPr>
-        <w:t xml:space="preserve">Figure </w:t>
-      </w:r>
-      <w:r>
-        <w:rPr>
-          <w:b/>
-          <w:bCs/>
-        </w:rPr>
-        <w:fldChar w:fldCharType="begin"/>
-      </w:r>
-      <w:r>
-        <w:rPr>
-          <w:b/>
-          <w:bCs/>
-        </w:rPr>
-        <w:instrText xml:space="preserve"> SEQ Figure \* ARABIC </w:instrText>
-      </w:r>
-      <w:r>
-        <w:rPr>
-          <w:b/>
-          <w:bCs/>
-        </w:rPr>
-        <w:fldChar w:fldCharType="separate"/>
-      </w:r>
-      <w:r>
-        <w:rPr>
-          <w:b/>
-          <w:bCs/>
-        </w:rPr>
-        <w:t>5</w:t>
-      </w:r>
-      <w:r>
-        <w:rPr>
-          <w:b/>
-          <w:bCs/>
-        </w:rPr>
-        <w:fldChar w:fldCharType="end"/>
-      </w:r>
-    </w:p>
-    <w:p>
-      <w:pPr>
-        <w:rPr>
-          <w:rFonts w:hint="default"/>
-          <w:lang w:val="en-US"/>
-        </w:rPr>
-      </w:pPr>
-    </w:p>
-    <w:p>
-      <w:pPr>
-        <w:rPr>
-          <w:rFonts w:hint="default"/>
-          <w:lang w:val="en-US"/>
-        </w:rPr>
-      </w:pPr>
-    </w:p>
-    <w:p>
-      <w:pPr>
-        <w:rPr>
-          <w:rFonts w:hint="default"/>
-          <w:lang w:val="en-US"/>
-        </w:rPr>
-      </w:pPr>
-      <w:r>
-        <w:rPr>
-          <w:rFonts w:hint="default"/>
-          <w:lang w:val="en-US"/>
-        </w:rPr>
-        <w:drawing>
-          <wp:inline distT="0" distB="0" distL="114300" distR="114300">
-            <wp:extent cx="5273675" cy="2526665"/>
-            <wp:effectExtent l="0" t="0" r="9525" b="635"/>
-            <wp:docPr id="4" name="Picture 4" descr="ADAM BOLA 2026-09-07 172726"/>
-            <wp:cNvGraphicFramePr>
-              <a:graphicFrameLocks xmlns:a="http://schemas.openxmlformats.org/drawingml/2006/main" noChangeAspect="1"/>
-            </wp:cNvGraphicFramePr>
-            <a:graphic xmlns:a="http://schemas.openxmlformats.org/drawingml/2006/main">
-              <a:graphicData uri="http://schemas.openxmlformats.org/drawingml/2006/picture">
-                <pic:pic xmlns:pic="http://schemas.openxmlformats.org/drawingml/2006/picture">
-                  <pic:nvPicPr>
-                    <pic:cNvPr id="4" name="Picture 4" descr="ADAM BOLA 2026-09-07 172726"/>
-                    <pic:cNvPicPr>
-                      <a:picLocks noChangeAspect="1"/>
-                    </pic:cNvPicPr>
-                  </pic:nvPicPr>
-                  <pic:blipFill>
-                    <a:blip r:embed="rId10"/>
-                    <a:stretch>
-                      <a:fillRect/>
-                    </a:stretch>
-                  </pic:blipFill>
-                  <pic:spPr>
-                    <a:xfrm>
-                      <a:off x="0" y="0"/>
-                      <a:ext cx="5273675" cy="2526665"/>
-                    </a:xfrm>
-                    <a:prstGeom prst="rect">
-                      <a:avLst/>
-                    </a:prstGeom>
-                  </pic:spPr>
-                </pic:pic>
-              </a:graphicData>
-            </a:graphic>
-          </wp:inline>
-        </w:drawing>
-      </w:r>
-    </w:p>
-    <w:p>
-      <w:pPr>
-        <w:pStyle w:val="11"/>
-        <w:rPr>
-          <w:rFonts w:hint="default"/>
-          <w:b/>
-          <w:bCs/>
-          <w:lang w:val="en-US"/>
-        </w:rPr>
-      </w:pPr>
-      <w:r>
-        <w:rPr>
-          <w:b/>
-          <w:bCs/>
-        </w:rPr>
-        <w:t xml:space="preserve">Figure </w:t>
-      </w:r>
-      <w:r>
-        <w:rPr>
-          <w:b/>
-          <w:bCs/>
-        </w:rPr>
-        <w:fldChar w:fldCharType="begin"/>
-      </w:r>
-      <w:r>
-        <w:rPr>
-          <w:b/>
-          <w:bCs/>
-        </w:rPr>
-        <w:instrText xml:space="preserve"> SEQ Figure \* ARABIC </w:instrText>
-      </w:r>
-      <w:r>
-        <w:rPr>
-          <w:b/>
-          <w:bCs/>
-        </w:rPr>
-        <w:fldChar w:fldCharType="separate"/>
-      </w:r>
-      <w:r>
-        <w:rPr>
-          <w:b/>
-          <w:bCs/>
-        </w:rPr>
-        <w:t>6</w:t>
-      </w:r>
-      <w:r>
-        <w:rPr>
-          <w:b/>
-          <w:bCs/>
-        </w:rPr>
-        <w:fldChar w:fldCharType="end"/>
-      </w:r>
-    </w:p>
-    <w:p>
-      <w:pPr>
-        <w:rPr>
-          <w:rFonts w:hint="default"/>
-          <w:lang w:val="en-US"/>
-        </w:rPr>
-      </w:pPr>
-    </w:p>
-    <w:p>
-      <w:pPr>
-        <w:rPr>
-          <w:rFonts w:hint="default"/>
-          <w:lang w:val="en-US"/>
-        </w:rPr>
-      </w:pPr>
-    </w:p>
-    <w:p>
-      <w:pPr>
         <w:rPr>
           <w:rFonts w:hint="default"/>
           <w:lang w:val="en-US"/>
@@ -2339,21 +2225,6 @@
           <w:lang w:val="en-US"/>
         </w:rPr>
         <w:t>Remediation</w:t>
-      </w:r>
-    </w:p>
-    <w:p>
-      <w:pPr>
-        <w:rPr>
-          <w:rFonts w:hint="default"/>
-          <w:lang w:val="en-US"/>
-        </w:rPr>
-      </w:pPr>
-      <w:r>
-        <w:rPr>
-          <w:rFonts w:hint="default"/>
-          <w:lang w:val="en-US"/>
-        </w:rPr>
-        <w:t>According to OWASP Website Security Testing Guide API Testing, here are ways that BOLA can be remediated:</w:t>
       </w:r>
     </w:p>
     <w:p>
@@ -2365,26 +2236,34 @@
         <w:ind w:left="418" w:leftChars="0" w:hanging="418" w:firstLineChars="0"/>
         <w:rPr>
           <w:rFonts w:hint="default"/>
-          <w:lang w:val="en-US"/>
-        </w:rPr>
-      </w:pPr>
-      <w:r>
-        <w:rPr>
-          <w:rFonts w:hint="default"/>
           <w:b/>
           <w:bCs/>
           <w:sz w:val="22"/>
           <w:szCs w:val="22"/>
           <w:lang w:val="en-US"/>
         </w:rPr>
-        <w:t>Object Ownership Checks:</w:t>
-      </w:r>
-      <w:r>
-        <w:rPr>
-          <w:rFonts w:hint="default"/>
-          <w:lang w:val="en-US"/>
-        </w:rPr>
-        <w:t xml:space="preserve"> Ensure that object-level authorization checks are performed for every API request. Always verify that the user making the request is authorized to access the requested object.</w:t>
+      </w:pPr>
+      <w:r>
+        <w:rPr>
+          <w:rFonts w:hint="default"/>
+          <w:b/>
+          <w:bCs/>
+          <w:sz w:val="22"/>
+          <w:szCs w:val="22"/>
+          <w:lang w:val="en-US"/>
+        </w:rPr>
+        <w:t>Disable Verbose Error Messages:</w:t>
+      </w:r>
+      <w:r>
+        <w:rPr>
+          <w:rFonts w:hint="default"/>
+          <w:b w:val="0"/>
+          <w:bCs w:val="0"/>
+          <w:sz w:val="22"/>
+          <w:szCs w:val="22"/>
+          <w:lang w:val="en-US"/>
+        </w:rPr>
+        <w:t xml:space="preserve"> Ensure production microservices do not leak stack traces, internal parameters, or endpoint paths to users.</w:t>
       </w:r>
     </w:p>
     <w:p>
@@ -2396,37 +2275,34 @@
         <w:ind w:left="418" w:leftChars="0" w:hanging="418" w:firstLineChars="0"/>
         <w:rPr>
           <w:rFonts w:hint="default"/>
-          <w:lang w:val="en-US"/>
-        </w:rPr>
-      </w:pPr>
-      <w:r>
-        <w:rPr>
-          <w:rFonts w:hint="default"/>
           <w:b/>
           <w:bCs/>
           <w:sz w:val="22"/>
           <w:szCs w:val="22"/>
           <w:lang w:val="en-US"/>
         </w:rPr>
-        <w:t>Role-Based Access Control (RBAC):</w:t>
-      </w:r>
-      <w:r>
-        <w:rPr>
-          <w:rFonts w:hint="default"/>
-          <w:b/>
-          <w:bCs/>
-          <w:sz w:val="21"/>
-          <w:szCs w:val="21"/>
-          <w:lang w:val="en-US"/>
-        </w:rPr>
-        <w:t xml:space="preserve"> </w:t>
-      </w:r>
-      <w:r>
-        <w:rPr>
-          <w:rFonts w:hint="default"/>
-          <w:lang w:val="en-US"/>
-        </w:rPr>
-        <w:t>Implement RBAC policies that define which roles can access or modify specific objects.</w:t>
+      </w:pPr>
+      <w:r>
+        <w:rPr>
+          <w:rFonts w:hint="default"/>
+          <w:b/>
+          <w:bCs/>
+          <w:sz w:val="22"/>
+          <w:szCs w:val="22"/>
+          <w:lang w:val="en-US"/>
+        </w:rPr>
+        <w:t xml:space="preserve"> Role-Based Access Control (RBAC): </w:t>
+      </w:r>
+      <w:r>
+        <w:rPr>
+          <w:rFonts w:hint="default"/>
+          <w:b w:val="0"/>
+          <w:bCs w:val="0"/>
+          <w:sz w:val="22"/>
+          <w:szCs w:val="22"/>
+          <w:lang w:val="en-US"/>
+        </w:rPr>
+        <w:t>Restrict access to administrative endpoints strictly to authorized roles within the controller layer</w:t>
       </w:r>
     </w:p>
     <w:p>
@@ -2438,39 +2314,12 @@
         <w:ind w:left="418" w:leftChars="0" w:hanging="418" w:firstLineChars="0"/>
         <w:rPr>
           <w:rFonts w:hint="default"/>
-          <w:lang w:val="en-US"/>
-        </w:rPr>
-      </w:pPr>
-      <w:r>
-        <w:rPr>
-          <w:rFonts w:hint="default"/>
-          <w:b/>
-          <w:bCs/>
+          <w:b w:val="0"/>
+          <w:bCs w:val="0"/>
           <w:sz w:val="22"/>
           <w:szCs w:val="22"/>
           <w:lang w:val="en-US"/>
         </w:rPr>
-        <w:t xml:space="preserve">Least Privilege Principle: </w:t>
-      </w:r>
-      <w:r>
-        <w:rPr>
-          <w:rFonts w:hint="default"/>
-          <w:lang w:val="en-US"/>
-        </w:rPr>
-        <w:t>Apply the principle of least privilege to ensure that users can only access the minimum set of objects they need for their role.</w:t>
-      </w:r>
-    </w:p>
-    <w:p>
-      <w:pPr>
-        <w:numPr>
-          <w:ilvl w:val="0"/>
-          <w:numId w:val="1"/>
-        </w:numPr>
-        <w:ind w:left="418" w:leftChars="0" w:hanging="418" w:firstLineChars="0"/>
-        <w:rPr>
-          <w:rFonts w:hint="default"/>
-          <w:lang w:val="en-US"/>
-        </w:rPr>
       </w:pPr>
       <w:r>
         <w:rPr>
@@ -2481,25 +2330,42 @@
           <w:szCs w:val="22"/>
           <w:lang w:val="en-US"/>
         </w:rPr>
-        <w:t>Use UUIDs (Universally Unique Identifier) or Non-Sequential IDs:</w:t>
-      </w:r>
-      <w:r>
-        <w:rPr>
-          <w:rFonts w:hint="default"/>
-          <w:b/>
-          <w:bCs/>
-          <w:sz w:val="21"/>
-          <w:szCs w:val="21"/>
-          <w:lang w:val="en-US"/>
-        </w:rPr>
-        <w:t xml:space="preserve"> </w:t>
-      </w:r>
-      <w:r>
-        <w:rPr>
-          <w:rFonts w:hint="default"/>
-          <w:lang w:val="en-US"/>
-        </w:rPr>
-        <w:t>Prefer non-predictable, non-sequential object identifiers (e.g., UUIDs instead of simple integers) to make enumeration and brute-force attacks harder.</w:t>
+        <w:t>Implement the Principle of Least Privilege:</w:t>
+      </w:r>
+      <w:r>
+        <w:rPr>
+          <w:rFonts w:hint="default"/>
+          <w:b w:val="0"/>
+          <w:bCs w:val="0"/>
+          <w:sz w:val="22"/>
+          <w:szCs w:val="22"/>
+          <w:lang w:val="en-US"/>
+        </w:rPr>
+        <w:t xml:space="preserve"> Deny access by default to any API path prefixed with</w:t>
+      </w:r>
+      <w:r>
+        <w:rPr>
+          <w:rFonts w:hint="default"/>
+          <w:b w:val="0"/>
+          <w:bCs w:val="0"/>
+          <w:i/>
+          <w:iCs/>
+          <w:sz w:val="22"/>
+          <w:szCs w:val="22"/>
+          <w:lang w:val="en-US"/>
+        </w:rPr>
+        <w:t xml:space="preserve"> /admin/ </w:t>
+      </w:r>
+      <w:r>
+        <w:rPr>
+          <w:rFonts w:hint="default"/>
+          <w:b w:val="0"/>
+          <w:bCs w:val="0"/>
+          <w:sz w:val="22"/>
+          <w:szCs w:val="22"/>
+          <w:lang w:val="en-US"/>
+        </w:rPr>
+        <w:t>unless the user session explicitly satisfies administrative policy criteria at the API gateway tier.</w:t>
       </w:r>
     </w:p>
     <w:p>
@@ -2674,7 +2540,7 @@
           <w:rFonts w:hint="default"/>
           <w:lang w:val="en-US"/>
         </w:rPr>
-        <w:t xml:space="preserve"> (PR: L): Low. Any standard, self-registered user on the platform possesses the necessary access level to initiate the attack vector.</w:t>
+        <w:t xml:space="preserve"> (PR: L): Low. Any standard, self-registered user on the platform possesses the necessary access level to trigger the initial error message and execute the subsequent administrative API call.</w:t>
       </w:r>
     </w:p>
     <w:p>
@@ -2759,70 +2625,55 @@
       <w:r>
         <w:rPr>
           <w:rFonts w:hint="default"/>
+          <w:lang w:val="en-US"/>
+        </w:rPr>
+        <w:t xml:space="preserve">By mapping a Medium Likelihood (dependent on finding the leaked path via error logs) against a High Business Impact (unauthorized, permanent deletion of application data assets), the vulnerability maps directly to a High Risk designation.           </w:t>
+      </w:r>
+    </w:p>
+    <w:p>
+      <w:pPr>
+        <w:rPr>
+          <w:rFonts w:hint="default"/>
+          <w:lang w:val="en-US"/>
+        </w:rPr>
+      </w:pPr>
+    </w:p>
+    <w:p>
+      <w:pPr>
+        <w:rPr>
+          <w:rFonts w:hint="default"/>
+          <w:lang w:val="en-US"/>
+        </w:rPr>
+      </w:pPr>
+      <w:r>
+        <w:rPr>
+          <w:rFonts w:hint="default"/>
           <w:lang w:val="en-US" w:eastAsia="zh-CN"/>
         </w:rPr>
-        <w:t>By mapping a High Likelihood of exploitability against a High Business Impact regarding data confidentiality, the vulnerability automatically escalates into a High Risk tier.</w:t>
-      </w:r>
-    </w:p>
-    <w:p>
-      <w:pPr>
-        <w:rPr>
-          <w:rFonts w:hint="default"/>
-          <w:lang w:val="en-US"/>
-        </w:rPr>
-      </w:pPr>
-      <w:r>
-        <w:rPr>
-          <w:rFonts w:hint="default"/>
-          <w:lang w:val="en-US"/>
-        </w:rPr>
-        <w:t xml:space="preserve">           </w:t>
-      </w:r>
-    </w:p>
-    <w:p>
-      <w:pPr>
-        <w:rPr>
-          <w:rFonts w:hint="default"/>
-          <w:lang w:val="en-US"/>
-        </w:rPr>
-      </w:pPr>
-    </w:p>
-    <w:p>
-      <w:pPr>
-        <w:rPr>
-          <w:rFonts w:hint="default"/>
-          <w:lang w:val="en-US"/>
-        </w:rPr>
-      </w:pPr>
-      <w:r>
-        <w:rPr>
-          <w:rFonts w:hint="default"/>
+        <w:t xml:space="preserve">3. </w:t>
+      </w:r>
+      <w:r>
+        <w:rPr>
+          <w:rFonts w:hint="default"/>
+          <w:b/>
+          <w:bCs/>
           <w:lang w:val="en-US" w:eastAsia="zh-CN"/>
         </w:rPr>
-        <w:t xml:space="preserve">3. </w:t>
-      </w:r>
-      <w:r>
-        <w:rPr>
-          <w:rFonts w:hint="default"/>
-          <w:b/>
-          <w:bCs/>
+        <w:t>CVSS v3.1 Vector Breakdown</w:t>
+      </w:r>
+    </w:p>
+    <w:p>
+      <w:pPr>
+        <w:rPr>
+          <w:rFonts w:hint="default"/>
+          <w:lang w:val="en-US"/>
+        </w:rPr>
+      </w:pPr>
+      <w:r>
+        <w:rPr>
+          <w:rFonts w:hint="default"/>
           <w:lang w:val="en-US" w:eastAsia="zh-CN"/>
         </w:rPr>
-        <w:t>CVSS v3.1 Vector Breakdown</w:t>
-      </w:r>
-    </w:p>
-    <w:p>
-      <w:pPr>
-        <w:rPr>
-          <w:rFonts w:hint="default"/>
-          <w:lang w:val="en-US"/>
-        </w:rPr>
-      </w:pPr>
-      <w:r>
-        <w:rPr>
-          <w:rFonts w:hint="default"/>
-          <w:lang w:val="en-US" w:eastAsia="zh-CN"/>
-        </w:rPr>
         <w:t>The assigned vector string CVSS:3.1/AV:N/AC:L/PR:L/UI:N/S:C/C:H/I:N/A:N formally indicates:</w:t>
       </w:r>
     </w:p>
@@ -2887,8 +2738,25 @@
           <w:rFonts w:hint="default"/>
           <w:lang w:val="en-US"/>
         </w:rPr>
-        <w:t>: Changed (S:C) — Bypassing the authentication mechanism on this endpoint allows an attacker to directly access data managed under a completely different user scope.</w:t>
-      </w:r>
+        <w:t>: Unc</w:t>
+      </w:r>
+      <w:bookmarkStart w:id="0" w:name="_GoBack"/>
+      <w:bookmarkEnd w:id="0"/>
+      <w:r>
+        <w:rPr>
+          <w:rFonts w:hint="default"/>
+          <w:lang w:val="en-US"/>
+        </w:rPr>
+        <w:t>hanged (S:U) — The compromised administrative functionality affects resources within the same underlying application architecture context.</w:t>
+      </w:r>
+    </w:p>
+    <w:p>
+      <w:pPr>
+        <w:rPr>
+          <w:rFonts w:hint="default"/>
+          <w:lang w:val="en-US"/>
+        </w:rPr>
+      </w:pPr>
     </w:p>
     <w:p>
       <w:pPr>
@@ -2899,16 +2767,6 @@
           <w:lang w:val="en-US"/>
         </w:rPr>
       </w:pPr>
-    </w:p>
-    <w:p>
-      <w:pPr>
-        <w:pStyle w:val="4"/>
-        <w:bidi w:val="0"/>
-        <w:rPr>
-          <w:rFonts w:hint="default"/>
-          <w:lang w:val="en-US"/>
-        </w:rPr>
-      </w:pPr>
       <w:r>
         <w:rPr>
           <w:rFonts w:hint="default"/>
@@ -2944,7 +2802,7 @@
           <w:rFonts w:hint="default"/>
           <w:lang w:val="en-US"/>
         </w:rPr>
-        <w:t>Hackerone</w:t>
+        <w:t>Akamai</w:t>
       </w:r>
     </w:p>
     <w:p>

</xml_diff>